<commit_message>
refactor: redesign prompt engine and document generation pipeline (v2.0.0 RC1)
</commit_message>
<xml_diff>
--- a/templates/Jaeha_Lee_CL.docx
+++ b/templates/Jaeha_Lee_CL.docx
@@ -5,96 +5,176 @@
     <w:p>
       <w:pPr>
         <w:pStyle w:val="a3"/>
-        <w:spacing w:after="160" w:afterAutospacing="0" w:line="259" w:lineRule="auto"/>
-        <w:rPr>
-          <w:rFonts w:ascii="Calibri" w:hAnsi="Calibri" w:cs="Calibri"/>
-          <w:sz w:val="22"/>
-          <w:szCs w:val="22"/>
-        </w:rPr>
-      </w:pPr>
-      <w:r>
-        <w:rPr>
-          <w:rStyle w:val="a4"/>
-          <w:rFonts w:ascii="Calibri" w:hAnsi="Calibri" w:cs="Calibri"/>
-          <w:b w:val="0"/>
-          <w:sz w:val="22"/>
-          <w:szCs w:val="22"/>
-        </w:rPr>
-        <w:t xml:space="preserve">Dear </w:t>
+        <w:spacing w:before="0" w:beforeAutospacing="0" w:after="0" w:afterAutospacing="0"/>
+        <w:rPr>
+          <w:rFonts w:ascii="Calibri" w:hAnsi="Calibri" w:cs="Calibri" w:hint="eastAsia"/>
+          <w:bCs/>
+          <w:sz w:val="21"/>
+          <w:szCs w:val="21"/>
+        </w:rPr>
+      </w:pPr>
+      <w:r>
+        <w:rPr>
+          <w:rFonts w:ascii="Calibri" w:hAnsi="Calibri" w:cs="Calibri"/>
+          <w:bCs/>
+          <w:sz w:val="21"/>
+          <w:szCs w:val="21"/>
+        </w:rPr>
+        <w:t>{{</w:t>
+      </w:r>
+      <w:r>
+        <w:rPr>
+          <w:rFonts w:ascii="Calibri" w:hAnsi="Calibri" w:cs="Calibri"/>
+          <w:bCs/>
+          <w:sz w:val="21"/>
+          <w:szCs w:val="21"/>
+        </w:rPr>
+        <w:t xml:space="preserve"> </w:t>
+      </w:r>
+      <w:r>
+        <w:rPr>
+          <w:rFonts w:ascii="Calibri" w:hAnsi="Calibri" w:cs="Calibri"/>
+          <w:bCs/>
+          <w:sz w:val="21"/>
+          <w:szCs w:val="21"/>
+        </w:rPr>
+        <w:t xml:space="preserve">greeting </w:t>
+      </w:r>
+      <w:r>
+        <w:rPr>
+          <w:rFonts w:ascii="Calibri" w:hAnsi="Calibri" w:cs="Calibri"/>
+          <w:bCs/>
+          <w:sz w:val="21"/>
+          <w:szCs w:val="21"/>
+        </w:rPr>
+        <w:t>}}</w:t>
       </w:r>
     </w:p>
     <w:p>
       <w:pPr>
         <w:pStyle w:val="a3"/>
-        <w:spacing w:after="160" w:afterAutospacing="0" w:line="259" w:lineRule="auto"/>
-        <w:rPr>
-          <w:rStyle w:val="a4"/>
-          <w:rFonts w:ascii="Calibri" w:hAnsi="Calibri" w:cs="Calibri"/>
-          <w:b w:val="0"/>
-          <w:sz w:val="22"/>
-          <w:szCs w:val="22"/>
-        </w:rPr>
-      </w:pPr>
-      <w:r>
-        <w:rPr>
-          <w:rStyle w:val="a4"/>
-          <w:rFonts w:ascii="Calibri" w:hAnsi="Calibri" w:cs="Calibri"/>
-          <w:b w:val="0"/>
-          <w:sz w:val="22"/>
-          <w:szCs w:val="22"/>
-        </w:rPr>
-        <w:t>Best regards</w:t>
-      </w:r>
-      <w:r>
-        <w:rPr>
-          <w:rStyle w:val="a4"/>
-          <w:rFonts w:ascii="Calibri" w:hAnsi="Calibri" w:cs="Calibri"/>
-          <w:b w:val="0"/>
-          <w:sz w:val="22"/>
-          <w:szCs w:val="22"/>
-        </w:rPr>
-        <w:t>,</w:t>
+        <w:spacing w:before="0" w:beforeAutospacing="0" w:after="0" w:afterAutospacing="0"/>
+        <w:rPr>
+          <w:rFonts w:ascii="Calibri" w:hAnsi="Calibri" w:cs="Calibri" w:hint="eastAsia"/>
+          <w:sz w:val="21"/>
+          <w:szCs w:val="21"/>
+        </w:rPr>
+      </w:pPr>
+      <w:r>
+        <w:rPr>
+          <w:rFonts w:ascii="Calibri" w:hAnsi="Calibri" w:cs="Calibri"/>
+          <w:sz w:val="21"/>
+          <w:szCs w:val="21"/>
+        </w:rPr>
+        <w:t>{{</w:t>
+      </w:r>
+      <w:r>
+        <w:rPr>
+          <w:rFonts w:ascii="Calibri" w:hAnsi="Calibri" w:cs="Calibri"/>
+          <w:sz w:val="21"/>
+          <w:szCs w:val="21"/>
+        </w:rPr>
+        <w:t xml:space="preserve"> </w:t>
+      </w:r>
+      <w:r>
+        <w:rPr>
+          <w:rFonts w:ascii="Calibri" w:hAnsi="Calibri" w:cs="Calibri"/>
+          <w:sz w:val="21"/>
+          <w:szCs w:val="21"/>
+        </w:rPr>
+        <w:t>body</w:t>
+      </w:r>
+      <w:r>
+        <w:rPr>
+          <w:rFonts w:ascii="Calibri" w:hAnsi="Calibri" w:cs="Calibri"/>
+          <w:sz w:val="21"/>
+          <w:szCs w:val="21"/>
+        </w:rPr>
+        <w:t xml:space="preserve"> </w:t>
+      </w:r>
+      <w:r>
+        <w:rPr>
+          <w:rFonts w:ascii="Calibri" w:hAnsi="Calibri" w:cs="Calibri"/>
+          <w:sz w:val="21"/>
+          <w:szCs w:val="21"/>
+        </w:rPr>
+        <w:t>}}</w:t>
       </w:r>
     </w:p>
     <w:p>
       <w:pPr>
         <w:pStyle w:val="a3"/>
-        <w:spacing w:after="160" w:afterAutospacing="0" w:line="259" w:lineRule="auto"/>
-        <w:rPr>
-          <w:rFonts w:ascii="Calibri" w:hAnsi="Calibri" w:cs="Calibri"/>
-          <w:sz w:val="22"/>
-          <w:szCs w:val="22"/>
-        </w:rPr>
-      </w:pPr>
-      <w:r>
-        <w:rPr>
-          <w:rFonts w:ascii="Calibri" w:hAnsi="Calibri" w:cs="Calibri"/>
-          <w:sz w:val="22"/>
-          <w:szCs w:val="22"/>
+        <w:spacing w:before="0" w:beforeAutospacing="0" w:after="0" w:afterAutospacing="0"/>
+        <w:rPr>
+          <w:rStyle w:val="a4"/>
+          <w:rFonts w:ascii="Calibri" w:hAnsi="Calibri" w:cs="Calibri" w:hint="eastAsia"/>
+          <w:b w:val="0"/>
+          <w:sz w:val="21"/>
+          <w:szCs w:val="21"/>
+        </w:rPr>
+      </w:pPr>
+      <w:r>
+        <w:rPr>
+          <w:rStyle w:val="a4"/>
+          <w:rFonts w:ascii="Calibri" w:hAnsi="Calibri" w:cs="Calibri"/>
+          <w:b w:val="0"/>
+          <w:sz w:val="21"/>
+          <w:szCs w:val="21"/>
+        </w:rPr>
+        <w:t>Best regards</w:t>
+      </w:r>
+      <w:r>
+        <w:rPr>
+          <w:rStyle w:val="a4"/>
+          <w:rFonts w:ascii="Calibri" w:hAnsi="Calibri" w:cs="Calibri"/>
+          <w:b w:val="0"/>
+          <w:sz w:val="21"/>
+          <w:szCs w:val="21"/>
+        </w:rPr>
+        <w:t>,</w:t>
+      </w:r>
+      <w:bookmarkStart w:id="0" w:name="_GoBack"/>
+      <w:bookmarkEnd w:id="0"/>
+    </w:p>
+    <w:p>
+      <w:pPr>
+        <w:pStyle w:val="a3"/>
+        <w:spacing w:before="0" w:beforeAutospacing="0" w:after="0" w:afterAutospacing="0"/>
+        <w:rPr>
+          <w:rFonts w:ascii="Calibri" w:hAnsi="Calibri" w:cs="Calibri"/>
+          <w:sz w:val="21"/>
+          <w:szCs w:val="21"/>
+        </w:rPr>
+      </w:pPr>
+      <w:r>
+        <w:rPr>
+          <w:rFonts w:ascii="Calibri" w:hAnsi="Calibri" w:cs="Calibri"/>
+          <w:sz w:val="21"/>
+          <w:szCs w:val="21"/>
         </w:rPr>
         <w:t>Jaeha Lee</w:t>
       </w:r>
       <w:r>
         <w:rPr>
           <w:rFonts w:ascii="Calibri" w:hAnsi="Calibri" w:cs="Calibri"/>
-          <w:sz w:val="22"/>
-          <w:szCs w:val="22"/>
+          <w:sz w:val="21"/>
+          <w:szCs w:val="21"/>
         </w:rPr>
         <w:br/>
       </w:r>
       <w:r>
         <w:rPr>
           <w:rFonts w:ascii="Calibri" w:hAnsi="Calibri" w:cs="Calibri"/>
-          <w:sz w:val="22"/>
-          <w:szCs w:val="22"/>
+          <w:sz w:val="21"/>
+          <w:szCs w:val="21"/>
         </w:rPr>
         <w:t>+34 684 485 843</w:t>
       </w:r>
       <w:r>
         <w:rPr>
           <w:rFonts w:ascii="Calibri" w:hAnsi="Calibri" w:cs="Calibri"/>
-          <w:sz w:val="22"/>
-          <w:szCs w:val="22"/>
+          <w:sz w:val="21"/>
+          <w:szCs w:val="21"/>
         </w:rPr>
         <w:br/>
         <w:t>jaehalee717@gmail.com</w:t>
@@ -102,8 +182,8 @@
       <w:r>
         <w:rPr>
           <w:rFonts w:ascii="Calibri" w:hAnsi="Calibri" w:cs="Calibri"/>
-          <w:sz w:val="22"/>
-          <w:szCs w:val="22"/>
+          <w:sz w:val="21"/>
+          <w:szCs w:val="21"/>
         </w:rPr>
         <w:br/>
         <w:t>LinkedIn: linkedin.com/in/jaehalee7</w:t>
@@ -111,14 +191,12 @@
       <w:r>
         <w:rPr>
           <w:rFonts w:ascii="Calibri" w:hAnsi="Calibri" w:cs="Calibri"/>
-          <w:sz w:val="22"/>
-          <w:szCs w:val="22"/>
+          <w:sz w:val="21"/>
+          <w:szCs w:val="21"/>
         </w:rPr>
         <w:br/>
         <w:t>Madrid, Spain | EU Long-term Resident (Full Work Authorization)</w:t>
       </w:r>
-      <w:bookmarkStart w:id="0" w:name="_GoBack"/>
-      <w:bookmarkEnd w:id="0"/>
     </w:p>
     <w:sectPr>
       <w:pgSz w:w="11906" w:h="16838"/>
@@ -1197,6 +1275,7 @@
   <w:style w:type="character" w:default="1" w:styleId="a0">
     <w:name w:val="Default Paragraph Font"/>
     <w:uiPriority w:val="1"/>
+    <w:semiHidden/>
     <w:unhideWhenUsed/>
   </w:style>
   <w:style w:type="table" w:default="1" w:styleId="a1">

</xml_diff>